<commit_message>
Rebuild portfolio around sen chapter motion and unified professional profile
</commit_message>
<xml_diff>
--- a/deliverables/resume/sun-yingjie-resume.docx
+++ b/deliverables/resume/sun-yingjie-resume.docx
@@ -2,84 +2,152 @@
 <file path=word/document.xml><?xml version="1.0" encoding="utf-8"?>
 <w:document xmlns:wpc="http://schemas.microsoft.com/office/word/2010/wordprocessingCanvas" xmlns:mo="http://schemas.microsoft.com/office/mac/office/2008/main" xmlns:mc="http://schemas.openxmlformats.org/markup-compatibility/2006" xmlns:mv="urn:schemas-microsoft-com:mac:vml" xmlns:o="urn:schemas-microsoft-com:office:office" xmlns:r="http://schemas.openxmlformats.org/officeDocument/2006/relationships" xmlns:m="http://schemas.openxmlformats.org/officeDocument/2006/math" xmlns:v="urn:schemas-microsoft-com:vml" xmlns:wp14="http://schemas.microsoft.com/office/word/2010/wordprocessingDrawing" xmlns:wp="http://schemas.openxmlformats.org/drawingml/2006/wordprocessingDrawing" xmlns:w10="urn:schemas-microsoft-com:office:word" xmlns:w="http://schemas.openxmlformats.org/wordprocessingml/2006/main" xmlns:w14="http://schemas.microsoft.com/office/word/2010/wordml" xmlns:wpg="http://schemas.microsoft.com/office/word/2010/wordprocessingGroup" xmlns:wpi="http://schemas.microsoft.com/office/word/2010/wordprocessingInk" xmlns:wne="http://schemas.microsoft.com/office/word/2006/wordml" xmlns:wps="http://schemas.microsoft.com/office/word/2010/wordprocessingShape" mc:Ignorable="w14 wp14">
   <w:body>
+    <w:tbl>
+      <w:tblPr>
+        <w:tblW w:type="auto" w:w="0"/>
+        <w:jc w:val="center"/>
+        <w:tblLayout w:type="fixed"/>
+        <w:tblLook w:firstColumn="1" w:firstRow="1" w:lastColumn="0" w:lastRow="0" w:noHBand="0" w:noVBand="1" w:val="04A0"/>
+      </w:tblPr>
+      <w:tblGrid>
+        <w:gridCol w:w="8447"/>
+        <w:gridCol w:w="1417"/>
+      </w:tblGrid>
+      <w:tr>
+        <w:tc>
+          <w:tcPr>
+            <w:tcW w:type="dxa" w:w="8447"/>
+            <w:vAlign w:val="center"/>
+            <w:hideMark/>
+          </w:tcPr>
+          <w:p>
+            <w:pPr>
+              <w:spacing w:line="740" w:lineRule="exact" w:after="80"/>
+            </w:pPr>
+            <w:r>
+              <w:rPr>
+                <w:b w:val="0"/>
+                <w:sz w:val="58"/>
+              </w:rPr>
+              <w:t>孙英杰</w:t>
+            </w:r>
+          </w:p>
+          <w:p>
+            <w:pPr>
+              <w:spacing w:after="120" w:before="0" w:line="300" w:lineRule="exact"/>
+              <w:snapToGrid w:val="0"/>
+            </w:pPr>
+            <w:r>
+              <w:rPr>
+                <w:b w:val="0"/>
+                <w:color w:val="52665E"/>
+                <w:sz w:val="22"/>
+              </w:rPr>
+              <w:t>品牌与产品设计＋AI</w:t>
+            </w:r>
+          </w:p>
+          <w:p>
+            <w:pPr>
+              <w:spacing w:after="0" w:before="0" w:line="300" w:lineRule="exact"/>
+              <w:snapToGrid w:val="0"/>
+            </w:pPr>
+            <w:r>
+              <w:rPr>
+                <w:b w:val="0"/>
+                <w:color w:val="52665E"/>
+                <w:sz w:val="17"/>
+              </w:rPr>
+              <w:t>13515249897    2950884508@qq.com</w:t>
+            </w:r>
+          </w:p>
+        </w:tc>
+        <w:tc>
+          <w:tcPr>
+            <w:tcW w:type="dxa" w:w="1417"/>
+            <w:vAlign w:val="center"/>
+            <w:hideMark/>
+          </w:tcPr>
+          <w:p>
+            <w:pPr>
+              <w:spacing w:line="240" w:lineRule="auto" w:after="0"/>
+            </w:pPr>
+            <w:r>
+              <w:drawing>
+                <wp:inline xmlns:a="http://schemas.openxmlformats.org/drawingml/2006/main" xmlns:pic="http://schemas.openxmlformats.org/drawingml/2006/picture">
+                  <wp:extent cx="828000" cy="828000"/>
+                  <wp:docPr id="1" name="Picture 1"/>
+                  <wp:cNvGraphicFramePr>
+                    <a:graphicFrameLocks noChangeAspect="1"/>
+                  </wp:cNvGraphicFramePr>
+                  <a:graphic>
+                    <a:graphicData uri="http://schemas.openxmlformats.org/drawingml/2006/picture">
+                      <pic:pic>
+                        <pic:nvPicPr>
+                          <pic:cNvPr id="0" name="portfolio-qr.png"/>
+                          <pic:cNvPicPr/>
+                        </pic:nvPicPr>
+                        <pic:blipFill>
+                          <a:blip r:embed="rId9"/>
+                          <a:stretch>
+                            <a:fillRect/>
+                          </a:stretch>
+                        </pic:blipFill>
+                        <pic:spPr>
+                          <a:xfrm>
+                            <a:off x="0" y="0"/>
+                            <a:ext cx="828000" cy="828000"/>
+                          </a:xfrm>
+                          <a:prstGeom prst="rect"/>
+                        </pic:spPr>
+                      </pic:pic>
+                    </a:graphicData>
+                  </a:graphic>
+                </wp:inline>
+              </w:drawing>
+            </w:r>
+          </w:p>
+          <w:p>
+            <w:pPr>
+              <w:spacing w:after="0" w:before="0" w:line="300" w:lineRule="exact"/>
+              <w:snapToGrid w:val="0"/>
+            </w:pPr>
+            <w:r>
+              <w:rPr>
+                <w:b w:val="0"/>
+                <w:color w:val="52665E"/>
+                <w:sz w:val="14"/>
+              </w:rPr>
+              <w:t>扫码查看作品</w:t>
+            </w:r>
+          </w:p>
+        </w:tc>
+      </w:tr>
+    </w:tbl>
     <w:p>
       <w:pPr>
-        <w:pStyle w:val="Title"/>
-        <w:spacing w:after="40" w:before="0" w:line="720" w:lineRule="exact"/>
+        <w:spacing w:after="100" w:before="180" w:line="300" w:lineRule="exact"/>
         <w:snapToGrid w:val="0"/>
       </w:pPr>
       <w:r>
         <w:rPr>
           <w:b w:val="0"/>
-          <w:sz w:val="60"/>
-        </w:rPr>
-        <w:t>孙英杰</w:t>
-      </w:r>
-    </w:p>
-    <w:p>
-      <w:pPr>
-        <w:spacing w:after="180" w:before="0" w:line="310" w:lineRule="exact"/>
-        <w:snapToGrid w:val="0"/>
-      </w:pPr>
-      <w:r>
-        <w:rPr>
-          <w:b w:val="0"/>
-          <w:color w:val="526750"/>
-          <w:sz w:val="24"/>
-        </w:rPr>
-        <w:t>产品设计师  /  3D 设计</w:t>
-      </w:r>
-    </w:p>
-    <w:p>
-      <w:pPr>
-        <w:spacing w:after="220" w:before="0" w:line="310" w:lineRule="exact"/>
-        <w:snapToGrid w:val="0"/>
-      </w:pPr>
-      <w:r>
-        <w:rPr>
-          <w:b w:val="0"/>
-          <w:color w:val="526750"/>
+          <w:color w:val="29343A"/>
           <w:sz w:val="18"/>
         </w:rPr>
-        <w:t>13515249897    2950884508@qq.com</w:t>
-      </w:r>
-      <w:r>
-        <w:t xml:space="preserve">    </w:t>
-      </w:r>
-      <w:hyperlink r:id="rId9">
-        <w:r>
-          <w:rPr>
-            <w:rFonts w:eastAsia="Microsoft YaHei"/>
-            <w:color w:val="526750"/>
-            <w:sz w:val="18"/>
-            <w:u w:val="single"/>
-          </w:rPr>
-          <w:t>在线作品集</w:t>
-        </w:r>
-      </w:hyperlink>
-    </w:p>
-    <w:p>
-      <w:pPr>
-        <w:spacing w:after="100" w:before="0" w:line="310" w:lineRule="exact"/>
-        <w:snapToGrid w:val="0"/>
-      </w:pPr>
-      <w:r>
-        <w:rPr>
-          <w:b w:val="0"/>
-          <w:sz w:val="19"/>
-        </w:rPr>
-        <w:t>以产品造型与三维表达为基础，参与商业橱窗、灯具系列与数字工具的设计。关注形态、材料和使用情境的关系，将概念转化为清晰的模型、场景与交互表达。</w:t>
+        <w:t>从商业橱窗、产品与三维表达，到品牌孵化和数字工具。以设计判断连接真实需求，用 AI 辅助研究、组织与实现。</w:t>
       </w:r>
     </w:p>
     <w:p>
       <w:pPr>
         <w:pStyle w:val="Heading1"/>
-        <w:spacing w:after="140" w:before="220" w:line="310" w:lineRule="exact"/>
+        <w:spacing w:after="120" w:before="200" w:line="300" w:lineRule="exact"/>
+        <w:keepNext/>
         <w:snapToGrid w:val="0"/>
       </w:pPr>
       <w:r>
         <w:rPr>
           <w:b/>
+          <w:color w:val="16272B"/>
           <w:sz w:val="22"/>
         </w:rPr>
         <w:t>工作经历</w:t>
@@ -87,25 +155,67 @@
     </w:p>
     <w:p>
       <w:pPr>
-        <w:spacing w:after="80" w:before="0" w:line="310" w:lineRule="exact"/>
+        <w:spacing w:after="60" w:before="0" w:line="300" w:lineRule="exact"/>
         <w:keepNext/>
         <w:tabs>
-          <w:tab w:pos="9524" w:val="right"/>
+          <w:tab w:pos="9865" w:val="right"/>
         </w:tabs>
         <w:snapToGrid w:val="0"/>
       </w:pPr>
       <w:r>
         <w:rPr>
           <w:b/>
-          <w:sz w:val="20"/>
+          <w:color w:val="29343A"/>
+          <w:sz w:val="19"/>
         </w:rPr>
-        <w:t>BENWU  ·  3D 设计师</w:t>
+        <w:t>杭州理灵企业服务有限公司  |  品牌孵化与设计</w:t>
       </w:r>
       <w:r>
         <w:rPr>
           <w:b w:val="0"/>
-          <w:color w:val="65765F"/>
-          <w:sz w:val="17"/>
+          <w:color w:val="65736D"/>
+          <w:sz w:val="16"/>
+        </w:rPr>
+        <w:tab/>
+        <w:t>2026.03 - 至今</w:t>
+      </w:r>
+    </w:p>
+    <w:p>
+      <w:pPr>
+        <w:spacing w:after="80" w:before="0" w:line="300" w:lineRule="exact"/>
+        <w:snapToGrid w:val="0"/>
+      </w:pPr>
+      <w:r>
+        <w:rPr>
+          <w:b w:val="0"/>
+          <w:color w:val="29343A"/>
+          <w:sz w:val="18"/>
+        </w:rPr>
+        <w:t>参与彼源 AI 品牌、官网视觉、交互与开发，连接品牌定位、页面信息组织与实际体验；参与夜礼司、Periastra 的品牌研究、图形演化和应用表达。</w:t>
+      </w:r>
+    </w:p>
+    <w:p>
+      <w:pPr>
+        <w:spacing w:after="60" w:before="0" w:line="300" w:lineRule="exact"/>
+        <w:keepNext/>
+        <w:tabs>
+          <w:tab w:pos="9865" w:val="right"/>
+        </w:tabs>
+        <w:snapToGrid w:val="0"/>
+      </w:pPr>
+      <w:r>
+        <w:rPr>
+          <w:b/>
+          <w:color w:val="29343A"/>
+          <w:sz w:val="19"/>
+        </w:rPr>
+        <w:t>BENWU  |  3D 设计师</w:t>
+      </w:r>
+      <w:r>
+        <w:rPr>
+          <w:b w:val="0"/>
+          <w:color w:val="65736D"/>
+          <w:sz w:val="16"/>
         </w:rPr>
         <w:tab/>
         <w:t>2025.03 - 2025.12</w:t>
@@ -113,104 +223,193 @@
     </w:p>
     <w:p>
       <w:pPr>
-        <w:spacing w:after="100" w:before="0" w:line="310" w:lineRule="exact"/>
+        <w:spacing w:after="80" w:before="0" w:line="300" w:lineRule="exact"/>
         <w:snapToGrid w:val="0"/>
       </w:pPr>
       <w:r>
         <w:rPr>
           <w:b w:val="0"/>
-          <w:sz w:val="20"/>
+          <w:color w:val="29343A"/>
+          <w:sz w:val="18"/>
         </w:rPr>
-        <w:t>参与 Hermès 夏、秋、冬季橱窗及 Arc'teryx Alpha Center 橱窗的三维设计与视觉呈现，围绕道具比例、商品位置和空间层次展开团队协作。</w:t>
+        <w:t>参与 Hermès 季节橱窗与 Arc'teryx Alpha Center 橱窗三维设计，围绕道具比例、商品位置、空间层次及材质灯光进行团队协作。</w:t>
       </w:r>
     </w:p>
     <w:p>
       <w:pPr>
-        <w:spacing w:after="100" w:before="0" w:line="310" w:lineRule="exact"/>
+        <w:spacing w:after="80" w:before="0" w:line="300" w:lineRule="exact"/>
         <w:snapToGrid w:val="0"/>
       </w:pPr>
       <w:r>
         <w:rPr>
           <w:b w:val="0"/>
-          <w:sz w:val="20"/>
+          <w:color w:val="29343A"/>
+          <w:sz w:val="18"/>
         </w:rPr>
-        <w:t>参与铝型材灯具系列的三维设计与场景表达，呈现台灯、落地灯、壁灯与吊灯的共同形态语言，以及金属表面、线性发光与空间尺度关系。</w:t>
+        <w:t>参与铝型材灯具系列的造型与场景表达，呈现台灯、落地灯、壁灯和吊灯的系列语言、结构关系与金属表面。</w:t>
       </w:r>
     </w:p>
     <w:p>
       <w:pPr>
-        <w:spacing w:after="80" w:before="0" w:line="310" w:lineRule="exact"/>
+        <w:spacing w:after="60" w:before="0" w:line="300" w:lineRule="exact"/>
         <w:keepNext/>
         <w:tabs>
-          <w:tab w:pos="9524" w:val="right"/>
+          <w:tab w:pos="9865" w:val="right"/>
         </w:tabs>
         <w:snapToGrid w:val="0"/>
       </w:pPr>
       <w:r>
         <w:rPr>
           <w:b/>
-          <w:sz w:val="20"/>
+          <w:color w:val="29343A"/>
+          <w:sz w:val="19"/>
         </w:rPr>
-        <w:t>湖南欧音文化传媒有限公司  ·  设计师助理</w:t>
+        <w:t>湖南欧音文化传媒有限公司  |  设计师助理</w:t>
       </w:r>
       <w:r>
         <w:rPr>
           <w:b w:val="0"/>
-          <w:color w:val="65765F"/>
-          <w:sz w:val="17"/>
+          <w:color w:val="65736D"/>
+          <w:sz w:val="16"/>
         </w:rPr>
         <w:tab/>
-        <w:t>2025</w:t>
+        <w:t>2023.12 - 2025.02</w:t>
       </w:r>
     </w:p>
     <w:p>
       <w:pPr>
-        <w:spacing w:after="100" w:before="0" w:line="310" w:lineRule="exact"/>
+        <w:spacing w:after="80" w:before="0" w:line="300" w:lineRule="exact"/>
         <w:snapToGrid w:val="0"/>
       </w:pPr>
       <w:r>
         <w:rPr>
           <w:b w:val="0"/>
-          <w:sz w:val="20"/>
+          <w:color w:val="29343A"/>
+          <w:sz w:val="18"/>
         </w:rPr>
-        <w:t>参与市场调研与用户反馈整理，使用 Figma 进行交互原型设计，配合团队讨论与完善用户体验流程。</w:t>
+        <w:t>参与市场调研、用户反馈整理与 Figma 交互原型设计，协助需求梳理和体验流程迭代。</w:t>
       </w:r>
     </w:p>
     <w:p>
       <w:pPr>
         <w:pStyle w:val="Heading1"/>
-        <w:spacing w:after="140" w:before="220" w:line="310" w:lineRule="exact"/>
+        <w:spacing w:after="120" w:before="200" w:line="300" w:lineRule="exact"/>
+        <w:keepNext/>
         <w:snapToGrid w:val="0"/>
       </w:pPr>
       <w:r>
         <w:rPr>
           <w:b/>
+          <w:color w:val="16272B"/>
           <w:sz w:val="22"/>
         </w:rPr>
-        <w:t>项目选录</w:t>
+        <w:t>代表项目</w:t>
       </w:r>
     </w:p>
     <w:p>
       <w:pPr>
-        <w:spacing w:after="80" w:before="0" w:line="310" w:lineRule="exact"/>
+        <w:spacing w:after="60" w:before="0" w:line="300" w:lineRule="exact"/>
         <w:keepNext/>
         <w:tabs>
-          <w:tab w:pos="9524" w:val="right"/>
+          <w:tab w:pos="9865" w:val="right"/>
         </w:tabs>
         <w:snapToGrid w:val="0"/>
       </w:pPr>
       <w:r>
         <w:rPr>
           <w:b/>
-          <w:sz w:val="20"/>
+          <w:color w:val="29343A"/>
+          <w:sz w:val="19"/>
         </w:rPr>
-        <w:t>HUHU CARE  ·  儿童呼气检测</w:t>
+        <w:t>镜序 Lensflow / 砚台 Yantai</w:t>
       </w:r>
       <w:r>
         <w:rPr>
           <w:b w:val="0"/>
-          <w:color w:val="65765F"/>
-          <w:sz w:val="17"/>
+          <w:color w:val="65736D"/>
+          <w:sz w:val="16"/>
+        </w:rPr>
+        <w:tab/>
+        <w:t>AI 与数字产品</w:t>
+      </w:r>
+    </w:p>
+    <w:p>
+      <w:pPr>
+        <w:spacing w:after="80" w:before="0" w:line="300" w:lineRule="exact"/>
+        <w:snapToGrid w:val="0"/>
+      </w:pPr>
+      <w:r>
+        <w:rPr>
+          <w:b w:val="0"/>
+          <w:color w:val="29343A"/>
+          <w:sz w:val="18"/>
+        </w:rPr>
+        <w:t>参与产品、交互与 AI 辅助实现，围绕参考采集、结构化分析、人工确认、任务恢复和来源归档构建工作流；镜序包含 Chrome 扩展与 Studio 工作区。</w:t>
+      </w:r>
+    </w:p>
+    <w:p>
+      <w:pPr>
+        <w:spacing w:after="60" w:before="0" w:line="300" w:lineRule="exact"/>
+        <w:keepNext/>
+        <w:tabs>
+          <w:tab w:pos="9865" w:val="right"/>
+        </w:tabs>
+        <w:snapToGrid w:val="0"/>
+      </w:pPr>
+      <w:r>
+        <w:rPr>
+          <w:b/>
+          <w:color w:val="29343A"/>
+          <w:sz w:val="19"/>
+        </w:rPr>
+        <w:t>薪跳 / 构线 Formline</w:t>
+      </w:r>
+      <w:r>
+        <w:rPr>
+          <w:b w:val="0"/>
+          <w:color w:val="65736D"/>
+          <w:sz w:val="16"/>
+        </w:rPr>
+        <w:tab/>
+        <w:t>交互与工具实践</w:t>
+      </w:r>
+    </w:p>
+    <w:p>
+      <w:pPr>
+        <w:spacing w:after="80" w:before="0" w:line="300" w:lineRule="exact"/>
+        <w:snapToGrid w:val="0"/>
+      </w:pPr>
+      <w:r>
+        <w:rPr>
+          <w:b w:val="0"/>
+          <w:color w:val="29343A"/>
+          <w:sz w:val="18"/>
+        </w:rPr>
+        <w:t>以原生微信小程序探索工资进度、日历与日记体验；通过构线实践几何约束、光学校正和矢量输出。保留上游来源与许可。</w:t>
+      </w:r>
+    </w:p>
+    <w:p>
+      <w:pPr>
+        <w:spacing w:after="60" w:before="0" w:line="300" w:lineRule="exact"/>
+        <w:keepNext/>
+        <w:tabs>
+          <w:tab w:pos="9865" w:val="right"/>
+        </w:tabs>
+        <w:snapToGrid w:val="0"/>
+      </w:pPr>
+      <w:r>
+        <w:rPr>
+          <w:b/>
+          <w:color w:val="29343A"/>
+          <w:sz w:val="19"/>
+        </w:rPr>
+        <w:t>引渡者管道机器人 / HUHU CARE</w:t>
+      </w:r>
+      <w:r>
+        <w:rPr>
+          <w:b w:val="0"/>
+          <w:color w:val="65736D"/>
+          <w:sz w:val="16"/>
         </w:rPr>
         <w:tab/>
         <w:t>合作概念项目</w:t>
@@ -218,104 +417,29 @@
     </w:p>
     <w:p>
       <w:pPr>
-        <w:spacing w:after="100" w:before="0" w:line="310" w:lineRule="exact"/>
+        <w:spacing w:after="80" w:before="0" w:line="300" w:lineRule="exact"/>
         <w:snapToGrid w:val="0"/>
       </w:pPr>
       <w:r>
         <w:rPr>
           <w:b w:val="0"/>
-          <w:sz w:val="20"/>
+          <w:color w:val="29343A"/>
+          <w:sz w:val="18"/>
         </w:rPr>
-        <w:t>围绕儿童、家长与医护人员的检查旅程，探索吹气球式引导、握持造型与灯光反馈。项目包含草图、手工形态模型、部件示意和场景渲染；处于概念提案阶段。</w:t>
+        <w:t>将使用情境转化为产品形态、结构示意及场景表达，以真实三维模型、材质灯光和多视角渲染说明设计思路。</w:t>
       </w:r>
     </w:p>
     <w:p>
       <w:pPr>
-        <w:spacing w:after="80" w:before="0" w:line="310" w:lineRule="exact"/>
+        <w:pStyle w:val="Heading1"/>
+        <w:spacing w:after="120" w:before="200" w:line="300" w:lineRule="exact"/>
         <w:keepNext/>
-        <w:tabs>
-          <w:tab w:pos="9524" w:val="right"/>
-        </w:tabs>
         <w:snapToGrid w:val="0"/>
       </w:pPr>
       <w:r>
         <w:rPr>
           <w:b/>
-          <w:sz w:val="20"/>
-        </w:rPr>
-        <w:t>镜序 Lensflow  ·  AI 创作工作台</w:t>
-      </w:r>
-      <w:r>
-        <w:rPr>
-          <w:b w:val="0"/>
-          <w:color w:val="65765F"/>
-          <w:sz w:val="17"/>
-        </w:rPr>
-        <w:tab/>
-        <w:t>共同创作</w:t>
-      </w:r>
-    </w:p>
-    <w:p>
-      <w:pPr>
-        <w:spacing w:after="100" w:before="0" w:line="310" w:lineRule="exact"/>
-        <w:snapToGrid w:val="0"/>
-      </w:pPr>
-      <w:r>
-        <w:rPr>
-          <w:b w:val="0"/>
-          <w:sz w:val="20"/>
-        </w:rPr>
-        <w:t>参与产品与交互共同创作，以采集、分析、简报和生成任务组织素材工作流。已有浏览器扩展、Studio 工作区与公开产品站，包含 AI 辅助实现及开源组件。</w:t>
-      </w:r>
-    </w:p>
-    <w:p>
-      <w:pPr>
-        <w:spacing w:after="80" w:before="0" w:line="310" w:lineRule="exact"/>
-        <w:keepNext/>
-        <w:tabs>
-          <w:tab w:pos="9524" w:val="right"/>
-        </w:tabs>
-        <w:snapToGrid w:val="0"/>
-      </w:pPr>
-      <w:r>
-        <w:rPr>
-          <w:b/>
-          <w:sz w:val="20"/>
-        </w:rPr>
-        <w:t>Periastra  ·  相机包品牌标志</w:t>
-      </w:r>
-      <w:r>
-        <w:rPr>
-          <w:b w:val="0"/>
-          <w:color w:val="65765F"/>
-          <w:sz w:val="17"/>
-        </w:rPr>
-        <w:tab/>
-        <w:t>共同创作</w:t>
-      </w:r>
-    </w:p>
-    <w:p>
-      <w:pPr>
-        <w:spacing w:after="100" w:before="0" w:line="310" w:lineRule="exact"/>
-        <w:snapToGrid w:val="0"/>
-      </w:pPr>
-      <w:r>
-        <w:rPr>
-          <w:b w:val="0"/>
-          <w:sz w:val="20"/>
-        </w:rPr>
-        <w:t>参与品牌图形与应用研究，将字母 P、镜头旋涡与保护容器整合为标志，整理结构、线宽与负形关系。当前为标志方案及应用研究，尚未作为投产成果。</w:t>
-      </w:r>
-    </w:p>
-    <w:p>
-      <w:pPr>
-        <w:pStyle w:val="Heading1"/>
-        <w:spacing w:after="140" w:before="220" w:line="310" w:lineRule="exact"/>
-        <w:snapToGrid w:val="0"/>
-      </w:pPr>
-      <w:r>
-        <w:rPr>
-          <w:b/>
+          <w:color w:val="16272B"/>
           <w:sz w:val="22"/>
         </w:rPr>
         <w:t>教育背景</w:t>
@@ -323,25 +447,26 @@
     </w:p>
     <w:p>
       <w:pPr>
-        <w:spacing w:after="80" w:before="0" w:line="310" w:lineRule="exact"/>
+        <w:spacing w:after="60" w:before="0" w:line="300" w:lineRule="exact"/>
         <w:keepNext/>
         <w:tabs>
-          <w:tab w:pos="9524" w:val="right"/>
+          <w:tab w:pos="9865" w:val="right"/>
         </w:tabs>
         <w:snapToGrid w:val="0"/>
       </w:pPr>
       <w:r>
         <w:rPr>
           <w:b/>
-          <w:sz w:val="20"/>
+          <w:color w:val="29343A"/>
+          <w:sz w:val="19"/>
         </w:rPr>
-        <w:t>常州工学院  ·  产品设计本科</w:t>
+        <w:t>常州工学院  |  产品设计本科</w:t>
       </w:r>
       <w:r>
         <w:rPr>
           <w:b w:val="0"/>
-          <w:color w:val="65765F"/>
-          <w:sz w:val="17"/>
+          <w:color w:val="65736D"/>
+          <w:sz w:val="16"/>
         </w:rPr>
         <w:tab/>
         <w:t>2021.09 - 2025.06</w:t>
@@ -349,60 +474,95 @@
     </w:p>
     <w:p>
       <w:pPr>
-        <w:spacing w:after="100" w:before="0" w:line="310" w:lineRule="exact"/>
+        <w:spacing w:after="80" w:before="0" w:line="300" w:lineRule="exact"/>
         <w:snapToGrid w:val="0"/>
       </w:pPr>
       <w:r>
         <w:rPr>
           <w:b w:val="0"/>
-          <w:sz w:val="20"/>
+          <w:color w:val="29343A"/>
+          <w:sz w:val="18"/>
         </w:rPr>
-        <w:t>课程涵盖产品设计方法、工程制图与 CAD、材料与加工工艺、人机工程学、产品结构设计及制造工程。</w:t>
+        <w:t>产品设计方法、材料与加工工艺、人机工程学、结构设计与工程制图。</w:t>
       </w:r>
     </w:p>
     <w:p>
       <w:pPr>
         <w:pStyle w:val="Heading1"/>
-        <w:spacing w:after="140" w:before="220" w:line="310" w:lineRule="exact"/>
+        <w:spacing w:after="120" w:before="200" w:line="300" w:lineRule="exact"/>
+        <w:keepNext/>
         <w:snapToGrid w:val="0"/>
       </w:pPr>
       <w:r>
         <w:rPr>
           <w:b/>
+          <w:color w:val="16272B"/>
           <w:sz w:val="22"/>
         </w:rPr>
-        <w:t>设计能力与工具</w:t>
+        <w:t>设计能力</w:t>
       </w:r>
     </w:p>
     <w:p>
       <w:pPr>
-        <w:spacing w:after="100" w:before="0" w:line="310" w:lineRule="exact"/>
+        <w:spacing w:after="80" w:before="0" w:line="300" w:lineRule="exact"/>
         <w:snapToGrid w:val="0"/>
       </w:pPr>
       <w:r>
         <w:rPr>
           <w:b w:val="0"/>
-          <w:sz w:val="20"/>
+          <w:color w:val="29343A"/>
+          <w:sz w:val="18"/>
         </w:rPr>
-        <w:t>产品造型与三维建模  ·  场景渲染与视觉表达  ·  用户研究与交互原型</w:t>
+        <w:t>产品与空间：Rhino、SolidWorks 建模，KeyShot / C4D / Blender 材质、灯光与构图。</w:t>
       </w:r>
     </w:p>
     <w:p>
       <w:pPr>
-        <w:spacing w:after="100" w:before="0" w:line="310" w:lineRule="exact"/>
+        <w:spacing w:after="80" w:before="0" w:line="300" w:lineRule="exact"/>
         <w:snapToGrid w:val="0"/>
       </w:pPr>
       <w:r>
         <w:rPr>
           <w:b w:val="0"/>
-          <w:sz w:val="20"/>
+          <w:color w:val="29343A"/>
+          <w:sz w:val="18"/>
         </w:rPr>
-        <w:t>Rhino  /  SolidWorks  /  Figma  /  CAD  /  AIGC 辅助设计</w:t>
+        <w:t>品牌与数字：品牌图形和应用系统、Figma 原型、交互逻辑与响应式界面。</w:t>
       </w:r>
+    </w:p>
+    <w:p>
+      <w:pPr>
+        <w:spacing w:after="80" w:before="0" w:line="300" w:lineRule="exact"/>
+        <w:snapToGrid w:val="0"/>
+      </w:pPr>
+      <w:r>
+        <w:rPr>
+          <w:b w:val="0"/>
+          <w:color w:val="29343A"/>
+          <w:sz w:val="18"/>
+        </w:rPr>
+        <w:t>AI 工作流：需求拆解、结构化提示、人工复核、版本与来源管理，关注实际限制。</w:t>
+      </w:r>
+    </w:p>
+    <w:p>
+      <w:pPr>
+        <w:spacing w:after="0" w:before="120" w:line="300" w:lineRule="exact"/>
+        <w:snapToGrid w:val="0"/>
+      </w:pPr>
+      <w:hyperlink r:id="rId10">
+        <w:r>
+          <w:rPr>
+            <w:b w:val="0"/>
+            <w:color w:val="52665E"/>
+            <w:sz w:val="14"/>
+          </w:rPr>
+          <w:t>https://sun-yingjie-portfolio.ajhhq.chatgpt.site</w:t>
+        </w:r>
+      </w:hyperlink>
     </w:p>
     <w:sectPr>
       <w:pgSz w:w="11906" w:h="16838"/>
-      <w:pgMar w:top="964" w:right="1191" w:bottom="907" w:left="1191" w:header="720" w:footer="720" w:gutter="0"/>
+      <w:pgMar w:top="850" w:right="1020" w:bottom="794" w:left="1020" w:header="720" w:footer="720" w:gutter="0"/>
       <w:cols w:space="720"/>
     </w:sectPr>
   </w:body>
@@ -773,12 +933,12 @@
     <w:qFormat/>
     <w:rsid w:val="00FC693F"/>
     <w:pPr>
-      <w:spacing w:line="310" w:lineRule="exact" w:after="100"/>
+      <w:spacing w:line="300" w:lineRule="exact" w:after="80"/>
     </w:pPr>
     <w:rPr>
       <w:rFonts w:ascii="Microsoft YaHei" w:hAnsi="Microsoft YaHei" w:eastAsia="Microsoft YaHei"/>
-      <w:color w:val="303731"/>
-      <w:sz w:val="19"/>
+      <w:color w:val="29343A"/>
+      <w:sz w:val="18"/>
     </w:rPr>
   </w:style>
   <w:style w:type="paragraph" w:styleId="Header">
@@ -843,7 +1003,7 @@
       <w:rFonts w:asciiTheme="majorHAnsi" w:eastAsiaTheme="majorEastAsia" w:hAnsiTheme="majorHAnsi" w:cstheme="majorBidi" w:ascii="Microsoft YaHei" w:hAnsi="Microsoft YaHei" w:eastAsia="Microsoft YaHei"/>
       <w:b/>
       <w:bCs/>
-      <w:color w:val="000000"/>
+      <w:color w:val="16272B"/>
       <w:sz w:val="28"/>
       <w:szCs w:val="28"/>
     </w:rPr>
@@ -1127,7 +1287,7 @@
     </w:pPr>
     <w:rPr>
       <w:rFonts w:asciiTheme="majorHAnsi" w:eastAsiaTheme="majorEastAsia" w:hAnsiTheme="majorHAnsi" w:cstheme="majorBidi" w:ascii="Microsoft YaHei" w:hAnsi="Microsoft YaHei" w:eastAsia="Microsoft YaHei"/>
-      <w:color w:val="000000"/>
+      <w:color w:val="16272B"/>
       <w:spacing w:val="5"/>
       <w:kern w:val="28"/>
       <w:sz w:val="52"/>

</xml_diff>

<commit_message>
Unify v5 narratives, original media, photo resume and 32-page portfolio
</commit_message>
<xml_diff>
--- a/deliverables/resume/sun-yingjie-resume.docx
+++ b/deliverables/resume/sun-yingjie-resume.docx
@@ -2,49 +2,113 @@
 <file path=word/document.xml><?xml version="1.0" encoding="utf-8"?>
 <w:document xmlns:wpc="http://schemas.microsoft.com/office/word/2010/wordprocessingCanvas" xmlns:mo="http://schemas.microsoft.com/office/mac/office/2008/main" xmlns:mc="http://schemas.openxmlformats.org/markup-compatibility/2006" xmlns:mv="urn:schemas-microsoft-com:mac:vml" xmlns:o="urn:schemas-microsoft-com:office:office" xmlns:r="http://schemas.openxmlformats.org/officeDocument/2006/relationships" xmlns:m="http://schemas.openxmlformats.org/officeDocument/2006/math" xmlns:v="urn:schemas-microsoft-com:vml" xmlns:wp14="http://schemas.microsoft.com/office/word/2010/wordprocessingDrawing" xmlns:wp="http://schemas.openxmlformats.org/drawingml/2006/wordprocessingDrawing" xmlns:w10="urn:schemas-microsoft-com:office:word" xmlns:w="http://schemas.openxmlformats.org/wordprocessingml/2006/main" xmlns:w14="http://schemas.microsoft.com/office/word/2010/wordml" xmlns:wpg="http://schemas.microsoft.com/office/word/2010/wordprocessingGroup" xmlns:wpi="http://schemas.microsoft.com/office/word/2010/wordprocessingInk" xmlns:wne="http://schemas.microsoft.com/office/word/2006/wordml" xmlns:wps="http://schemas.microsoft.com/office/word/2010/wordprocessingShape" mc:Ignorable="w14 wp14">
   <w:body>
-    <w:p>
-      <w:pPr>
-        <w:pStyle w:val="Title"/>
-        <w:spacing w:after="100" w:before="0" w:line="672" w:lineRule="exact"/>
-        <w:snapToGrid w:val="0"/>
-      </w:pPr>
-      <w:r>
-        <w:rPr>
-          <w:b w:val="0"/>
-          <w:color w:val="000000"/>
-          <w:sz w:val="56"/>
-        </w:rPr>
-        <w:t>孙英杰</w:t>
-      </w:r>
-    </w:p>
-    <w:p>
-      <w:pPr>
-        <w:spacing w:after="120" w:before="0" w:line="290" w:lineRule="exact"/>
-        <w:snapToGrid w:val="0"/>
-      </w:pPr>
-      <w:r>
-        <w:rPr>
-          <w:b w:val="0"/>
-          <w:color w:val="000000"/>
-          <w:sz w:val="22"/>
-        </w:rPr>
-        <w:t>品牌与产品设计＋AI</w:t>
-      </w:r>
-    </w:p>
-    <w:p>
-      <w:pPr>
-        <w:spacing w:after="0" w:before="0" w:line="290" w:lineRule="exact"/>
-        <w:snapToGrid w:val="0"/>
-      </w:pPr>
-      <w:r>
-        <w:rPr>
-          <w:b w:val="0"/>
-          <w:color w:val="52665E"/>
-          <w:sz w:val="17"/>
-        </w:rPr>
-        <w:t>13515249897    2950884508@qq.com</w:t>
-      </w:r>
-    </w:p>
+    <w:tbl>
+      <w:tblPr>
+        <w:tblW w:type="auto" w:w="0"/>
+        <w:tblLayout w:type="fixed"/>
+        <w:tblLook w:firstColumn="1" w:firstRow="1" w:lastColumn="0" w:lastRow="0" w:noHBand="0" w:noVBand="1" w:val="04A0"/>
+      </w:tblPr>
+      <w:tblGrid>
+        <w:gridCol w:w="7880"/>
+        <w:gridCol w:w="1984"/>
+      </w:tblGrid>
+      <w:tr>
+        <w:tc>
+          <w:tcPr>
+            <w:tcW w:type="dxa" w:w="7880"/>
+            <w:vAlign w:val="center"/>
+          </w:tcPr>
+          <w:p>
+            <w:pPr>
+              <w:pStyle w:val="Title"/>
+              <w:spacing w:after="100" w:before="0" w:line="672" w:lineRule="exact"/>
+              <w:snapToGrid w:val="0"/>
+            </w:pPr>
+            <w:r>
+              <w:rPr>
+                <w:b w:val="0"/>
+                <w:color w:val="000000"/>
+                <w:sz w:val="56"/>
+              </w:rPr>
+              <w:t>孙英杰</w:t>
+            </w:r>
+          </w:p>
+          <w:p>
+            <w:pPr>
+              <w:spacing w:after="120" w:before="0" w:line="290" w:lineRule="exact"/>
+              <w:snapToGrid w:val="0"/>
+            </w:pPr>
+            <w:r>
+              <w:rPr>
+                <w:b w:val="0"/>
+                <w:color w:val="000000"/>
+                <w:sz w:val="20"/>
+              </w:rPr>
+              <w:t>品牌与产品设计师｜AI 辅助设计与数字体验</w:t>
+            </w:r>
+          </w:p>
+          <w:p>
+            <w:pPr>
+              <w:spacing w:after="0" w:before="0" w:line="290" w:lineRule="exact"/>
+              <w:snapToGrid w:val="0"/>
+            </w:pPr>
+            <w:r>
+              <w:rPr>
+                <w:b w:val="0"/>
+                <w:color w:val="52665E"/>
+                <w:sz w:val="17"/>
+              </w:rPr>
+              <w:t>13515249897    2950884508@qq.com</w:t>
+            </w:r>
+          </w:p>
+        </w:tc>
+        <w:tc>
+          <w:tcPr>
+            <w:tcW w:type="dxa" w:w="1984"/>
+            <w:vAlign w:val="center"/>
+          </w:tcPr>
+          <w:p>
+            <w:pPr>
+              <w:spacing w:line="240" w:lineRule="auto" w:after="0"/>
+            </w:pPr>
+            <w:r>
+              <w:drawing>
+                <wp:inline xmlns:a="http://schemas.openxmlformats.org/drawingml/2006/main" xmlns:pic="http://schemas.openxmlformats.org/drawingml/2006/picture">
+                  <wp:extent cx="1044000" cy="1044000"/>
+                  <wp:docPr id="1" name="Picture 1"/>
+                  <wp:cNvGraphicFramePr>
+                    <a:graphicFrameLocks noChangeAspect="1"/>
+                  </wp:cNvGraphicFramePr>
+                  <a:graphic>
+                    <a:graphicData uri="http://schemas.openxmlformats.org/drawingml/2006/picture">
+                      <pic:pic>
+                        <pic:nvPicPr>
+                          <pic:cNvPr id="0" name="portrait.png"/>
+                          <pic:cNvPicPr/>
+                        </pic:nvPicPr>
+                        <pic:blipFill>
+                          <a:blip r:embed="rId9"/>
+                          <a:stretch>
+                            <a:fillRect/>
+                          </a:stretch>
+                        </pic:blipFill>
+                        <pic:spPr>
+                          <a:xfrm>
+                            <a:off x="0" y="0"/>
+                            <a:ext cx="1044000" cy="1044000"/>
+                          </a:xfrm>
+                          <a:prstGeom prst="rect"/>
+                        </pic:spPr>
+                      </pic:pic>
+                    </a:graphicData>
+                  </a:graphic>
+                </wp:inline>
+              </w:drawing>
+            </w:r>
+          </w:p>
+        </w:tc>
+      </w:tr>
+    </w:tbl>
     <w:p>
       <w:pPr>
         <w:spacing w:after="80" w:before="200" w:line="290" w:lineRule="exact"/>
@@ -56,7 +120,7 @@
           <w:color w:val="29343A"/>
           <w:sz w:val="18"/>
         </w:rPr>
-        <w:t>从商业橱窗、产品与三维表达，到品牌孵化和数字工具。以设计判断连接真实需求，用 AI 辅助研究、组织与实现。</w:t>
+        <w:t>连接品牌识别、产品形态与数字体验。从问题梳理、视觉系统到模型、原型与上线协作，用 AI 加快探索，用设计判断推动方案落地。</w:t>
       </w:r>
     </w:p>
     <w:p>
@@ -90,7 +154,7 @@
           <w:color w:val="29343A"/>
           <w:sz w:val="19"/>
         </w:rPr>
-        <w:t>杭州理灵企业服务有限公司  |  品牌孵化与设计</w:t>
+        <w:t>杭州理灵企业服务有限公司  |  品牌设计与项目推进</w:t>
       </w:r>
       <w:r>
         <w:rPr>
@@ -99,7 +163,7 @@
           <w:sz w:val="16"/>
         </w:rPr>
         <w:tab/>
-        <w:t>2026.03 - 至今</w:t>
+        <w:t>2026.02 - 2026.09</w:t>
       </w:r>
     </w:p>
     <w:p>
@@ -113,7 +177,7 @@
           <w:color w:val="29343A"/>
           <w:sz w:val="18"/>
         </w:rPr>
-        <w:t>参与彼源 AI 品牌、官网视觉、交互与开发，连接品牌定位、页面信息组织与实际体验；参与夜礼司、Periastra 的品牌研究、图形演化和应用表达。</w:t>
+        <w:t>负责彼源 AI 整体视觉设计并辅助上线，连接品牌识别、官网层级与模型入口；推进 Periastra、夜礼司品牌研究、标志方案与应用表达，协调方向、版本与交付。</w:t>
       </w:r>
     </w:p>
     <w:p>
@@ -284,7 +348,7 @@
           <w:color w:val="29343A"/>
           <w:sz w:val="19"/>
         </w:rPr>
-        <w:t>Periastra 相机包品牌标志</w:t>
+        <w:t>Periastra 摄影装备品牌识别</w:t>
       </w:r>
       <w:r>
         <w:rPr>
@@ -293,7 +357,7 @@
           <w:sz w:val="16"/>
         </w:rPr>
         <w:tab/>
-        <w:t>共同创作</w:t>
+        <w:t>品牌设计与推进</w:t>
       </w:r>
     </w:p>
     <w:p>
@@ -307,48 +371,7 @@
           <w:color w:val="29343A"/>
           <w:sz w:val="18"/>
         </w:rPr>
-        <w:t>参与图形与应用研究，以 P、镜头与保护框架建立识别顺序；分析线宽、负形和小尺寸表现，区分图形研究与尚未验证的实体工艺。</w:t>
-      </w:r>
-    </w:p>
-    <w:p>
-      <w:pPr>
-        <w:spacing w:after="60" w:before="0" w:line="290" w:lineRule="exact"/>
-        <w:keepNext/>
-        <w:tabs>
-          <w:tab w:pos="9865" w:val="right"/>
-        </w:tabs>
-        <w:snapToGrid w:val="0"/>
-      </w:pPr>
-      <w:r>
-        <w:rPr>
-          <w:b/>
-          <w:color w:val="29343A"/>
-          <w:sz w:val="19"/>
-        </w:rPr>
-        <w:t>引渡者管道机器人 / HUHU CARE</w:t>
-      </w:r>
-      <w:r>
-        <w:rPr>
-          <w:b w:val="0"/>
-          <w:color w:val="65736D"/>
-          <w:sz w:val="16"/>
-        </w:rPr>
-        <w:tab/>
-        <w:t>合作概念项目</w:t>
-      </w:r>
-    </w:p>
-    <w:p>
-      <w:pPr>
-        <w:spacing w:after="80" w:before="0" w:line="290" w:lineRule="exact"/>
-        <w:snapToGrid w:val="0"/>
-      </w:pPr>
-      <w:r>
-        <w:rPr>
-          <w:b w:val="0"/>
-          <w:color w:val="29343A"/>
-          <w:sz w:val="18"/>
-        </w:rPr>
-        <w:t>通过服务关系、产品形态、结构示意与多视角渲染说明概念；保留合作属性和原始署名，明确样机、工程及使用测试尚待验证。</w:t>
+        <w:t>推进图形探索、方案比较与应用研究，从早期 P 符号收束到已采用的 PERIASTRA 字体标志；整理版本与应用检查要点。</w:t>
       </w:r>
     </w:p>
     <w:p>
@@ -471,7 +494,7 @@
         <w:spacing w:after="0" w:before="120" w:line="290" w:lineRule="exact"/>
         <w:snapToGrid w:val="0"/>
       </w:pPr>
-      <w:hyperlink r:id="rId9">
+      <w:hyperlink r:id="rId10">
         <w:r>
           <w:rPr>
             <w:b w:val="0"/>
@@ -482,9 +505,54 @@
         </w:r>
       </w:hyperlink>
     </w:p>
+    <w:p>
+      <w:pPr>
+        <w:spacing w:line="240" w:lineRule="auto" w:before="60" w:after="0"/>
+      </w:pPr>
+      <w:r>
+        <w:drawing>
+          <wp:inline xmlns:a="http://schemas.openxmlformats.org/drawingml/2006/main" xmlns:pic="http://schemas.openxmlformats.org/drawingml/2006/picture">
+            <wp:extent cx="720000" cy="720000"/>
+            <wp:docPr id="2" name="Picture 2"/>
+            <wp:cNvGraphicFramePr>
+              <a:graphicFrameLocks noChangeAspect="1"/>
+            </wp:cNvGraphicFramePr>
+            <a:graphic>
+              <a:graphicData uri="http://schemas.openxmlformats.org/drawingml/2006/picture">
+                <pic:pic>
+                  <pic:nvPicPr>
+                    <pic:cNvPr id="0" name="portfolio-qr.png"/>
+                    <pic:cNvPicPr/>
+                  </pic:nvPicPr>
+                  <pic:blipFill>
+                    <a:blip r:embed="rId11"/>
+                    <a:stretch>
+                      <a:fillRect/>
+                    </a:stretch>
+                  </pic:blipFill>
+                  <pic:spPr>
+                    <a:xfrm>
+                      <a:off x="0" y="0"/>
+                      <a:ext cx="720000" cy="720000"/>
+                    </a:xfrm>
+                    <a:prstGeom prst="rect"/>
+                  </pic:spPr>
+                </pic:pic>
+              </a:graphicData>
+            </a:graphic>
+          </wp:inline>
+        </w:drawing>
+      </w:r>
+      <w:r>
+        <w:rPr>
+          <w:sz w:val="16"/>
+        </w:rPr>
+        <w:t xml:space="preserve">  扫码查看完整作品与交互案例</w:t>
+      </w:r>
+    </w:p>
     <w:sectPr>
       <w:pgSz w:w="11906" w:h="16838"/>
-      <w:pgMar w:top="907" w:right="1020" w:bottom="850" w:left="1020" w:header="720" w:footer="720" w:gutter="0"/>
+      <w:pgMar w:top="737" w:right="1020" w:bottom="850" w:left="1020" w:header="720" w:footer="720" w:gutter="0"/>
       <w:cols w:space="720"/>
     </w:sectPr>
   </w:body>

</xml_diff>